<commit_message>
aggiornate equazioni del simulatore
</commit_message>
<xml_diff>
--- a/tesi/grafici.docx
+++ b/tesi/grafici.docx
@@ -4379,13 +4379,22 @@
         </w:rPr>
         <w:t xml:space="preserve"> = </w:t>
       </w:r>
+      <w:proofErr w:type="spellStart"/>
       <w:proofErr w:type="gramStart"/>
       <w:r>
         <w:rPr>
           <w:sz w:val="16"/>
           <w:szCs w:val="16"/>
         </w:rPr>
-        <w:t>diag(</w:t>
+        <w:t>diag</w:t>
+      </w:r>
+      <w:proofErr w:type="spellEnd"/>
+      <w:r>
+        <w:rPr>
+          <w:sz w:val="16"/>
+          <w:szCs w:val="16"/>
+        </w:rPr>
+        <w:t>(</w:t>
       </w:r>
       <w:proofErr w:type="gramEnd"/>
       <w:r>
@@ -6434,6 +6443,101 @@
               </a:graphicData>
             </a:graphic>
           </wp:inline>
+        </w:drawing>
+      </w:r>
+    </w:p>
+    <w:p>
+      <w:pPr>
+        <w:rPr>
+          <w:sz w:val="24"/>
+          <w:szCs w:val="24"/>
+        </w:rPr>
+      </w:pPr>
+      <w:r>
+        <w:rPr>
+          <w:sz w:val="24"/>
+          <w:szCs w:val="24"/>
+        </w:rPr>
+        <w:br w:type="page"/>
+      </w:r>
+    </w:p>
+    <w:p>
+      <w:pPr>
+        <w:rPr>
+          <w:sz w:val="24"/>
+          <w:szCs w:val="24"/>
+        </w:rPr>
+      </w:pPr>
+      <w:r>
+        <w:rPr>
+          <w:sz w:val="24"/>
+          <w:szCs w:val="24"/>
+        </w:rPr>
+        <w:lastRenderedPageBreak/>
+        <w:t>TEST CON NUOVO MOTORE FISICO</w:t>
+      </w:r>
+    </w:p>
+    <w:p>
+      <w:pPr>
+        <w:rPr>
+          <w:b/>
+          <w:bCs/>
+          <w:sz w:val="24"/>
+          <w:szCs w:val="24"/>
+        </w:rPr>
+      </w:pPr>
+      <w:r>
+        <w:rPr>
+          <w:noProof/>
+        </w:rPr>
+        <w:drawing>
+          <wp:anchor distT="0" distB="0" distL="114300" distR="114300" simplePos="0" relativeHeight="251658240" behindDoc="1" locked="0" layoutInCell="1" allowOverlap="1" wp14:anchorId="0790265F" wp14:editId="6DF865FA">
+            <wp:simplePos x="0" y="0"/>
+            <wp:positionH relativeFrom="column">
+              <wp:posOffset>20619</wp:posOffset>
+            </wp:positionH>
+            <wp:positionV relativeFrom="paragraph">
+              <wp:posOffset>5043</wp:posOffset>
+            </wp:positionV>
+            <wp:extent cx="6120130" cy="4008755"/>
+            <wp:effectExtent l="0" t="0" r="0" b="0"/>
+            <wp:wrapNone/>
+            <wp:docPr id="1528188915" name="Immagine 1" descr="Immagine che contiene testo, linea, Diagramma, diagramma&#10;&#10;Il contenuto generato dall'IA potrebbe non essere corretto."/>
+            <wp:cNvGraphicFramePr>
+              <a:graphicFrameLocks xmlns:a="http://schemas.openxmlformats.org/drawingml/2006/main" noChangeAspect="1"/>
+            </wp:cNvGraphicFramePr>
+            <a:graphic xmlns:a="http://schemas.openxmlformats.org/drawingml/2006/main">
+              <a:graphicData uri="http://schemas.openxmlformats.org/drawingml/2006/picture">
+                <pic:pic xmlns:pic="http://schemas.openxmlformats.org/drawingml/2006/picture">
+                  <pic:nvPicPr>
+                    <pic:cNvPr id="1528188915" name="Immagine 1" descr="Immagine che contiene testo, linea, Diagramma, diagramma&#10;&#10;Il contenuto generato dall'IA potrebbe non essere corretto."/>
+                    <pic:cNvPicPr/>
+                  </pic:nvPicPr>
+                  <pic:blipFill>
+                    <a:blip r:embed="rId35">
+                      <a:extLst>
+                        <a:ext uri="{28A0092B-C50C-407E-A947-70E740481C1C}">
+                          <a14:useLocalDpi xmlns:a14="http://schemas.microsoft.com/office/drawing/2010/main" val="0"/>
+                        </a:ext>
+                      </a:extLst>
+                    </a:blip>
+                    <a:stretch>
+                      <a:fillRect/>
+                    </a:stretch>
+                  </pic:blipFill>
+                  <pic:spPr>
+                    <a:xfrm>
+                      <a:off x="0" y="0"/>
+                      <a:ext cx="6120130" cy="4008755"/>
+                    </a:xfrm>
+                    <a:prstGeom prst="rect">
+                      <a:avLst/>
+                    </a:prstGeom>
+                  </pic:spPr>
+                </pic:pic>
+              </a:graphicData>
+            </a:graphic>
+          </wp:anchor>
         </w:drawing>
       </w:r>
     </w:p>
@@ -7050,7 +7154,6 @@
   <w:style w:type="character" w:default="1" w:styleId="Carpredefinitoparagrafo">
     <w:name w:val="Default Paragraph Font"/>
     <w:uiPriority w:val="1"/>
-    <w:semiHidden/>
     <w:unhideWhenUsed/>
   </w:style>
   <w:style w:type="table" w:default="1" w:styleId="Tabellanormale">

</xml_diff>